<commit_message>
cascade: docs(requests): BG-20260930-2222 -- resolve latest-btw paste error, map to in-flight SpecKit-004 fast-dev-cycles, record 10h merge-to-main directive
Co-Authored-By: Claude Sonnet 5 <noreply@anthropic.com>

(committed by parent commit_all.sh cascade depth=1)
</commit_message>
<xml_diff>
--- a/docs/codegraph/Status.docx
+++ b/docs/codegraph/Status.docx
@@ -2,7 +2,7 @@
 <file path=word/document.xml><?xml version="1.0" encoding="utf-8"?>
 <w:document xmlns:w="http://schemas.openxmlformats.org/wordprocessingml/2006/main" xmlns:m="http://schemas.openxmlformats.org/officeDocument/2006/math" xmlns:r="http://schemas.openxmlformats.org/officeDocument/2006/relationships" xmlns:o="urn:schemas-microsoft-com:office:office" xmlns:v="urn:schemas-microsoft-com:vml" xmlns:w10="urn:schemas-microsoft-com:office:word" xmlns:a="http://schemas.openxmlformats.org/drawingml/2006/main" xmlns:pic="http://schemas.openxmlformats.org/drawingml/2006/picture" xmlns:wp="http://schemas.openxmlformats.org/drawingml/2006/wordprocessingDrawing">
   <w:body>
-    <w:bookmarkStart w:id="57" w:name="codegraph--status"/>
+    <w:bookmarkStart w:id="62" w:name="codegraph--status"/>
     <w:p>
       <w:pPr>
         <w:pStyle w:val="Heading1"/>
@@ -4063,7 +4063,402 @@
       </w:r>
     </w:p>
     <w:bookmarkEnd w:id="56"/>
+    <w:bookmarkStart w:id="57" w:name="X59eb55b90a239b99e4d9d22f66c9e1042063b03"/>
+    <w:p>
+      <w:pPr>
+        <w:pStyle w:val="Heading2"/>
+      </w:pPr>
+      <w:r>
+        <w:t xml:space="preserve">2026-09-29T14:46:47Z — codegraph update FAILED (§107 bluff caught)</w:t>
+      </w:r>
+    </w:p>
+    <w:p>
+      <w:pPr>
+        <w:pStyle w:val="Compact"/>
+        <w:numPr>
+          <w:ilvl w:val="0"/>
+          <w:numId w:val="1047"/>
+        </w:numPr>
+      </w:pPr>
+      <w:r>
+        <w:t xml:space="preserve">before:</w:t>
+      </w:r>
+      <w:r>
+        <w:t xml:space="preserve"> </w:t>
+      </w:r>
+      <w:r>
+        <w:rPr>
+          <w:rStyle w:val="VerbatimChar"/>
+        </w:rPr>
+        <w:t xml:space="preserve">1.6.0</w:t>
+      </w:r>
+    </w:p>
+    <w:p>
+      <w:pPr>
+        <w:pStyle w:val="Compact"/>
+        <w:numPr>
+          <w:ilvl w:val="0"/>
+          <w:numId w:val="1047"/>
+        </w:numPr>
+      </w:pPr>
+      <w:r>
+        <w:t xml:space="preserve">target:</w:t>
+      </w:r>
+      <w:r>
+        <w:t xml:space="preserve"> </w:t>
+      </w:r>
+      <w:r>
+        <w:rPr>
+          <w:rStyle w:val="VerbatimChar"/>
+        </w:rPr>
+        <w:t xml:space="preserve">1.6.1</w:t>
+      </w:r>
+    </w:p>
+    <w:p>
+      <w:pPr>
+        <w:pStyle w:val="Compact"/>
+        <w:numPr>
+          <w:ilvl w:val="0"/>
+          <w:numId w:val="1047"/>
+        </w:numPr>
+      </w:pPr>
+      <w:r>
+        <w:t xml:space="preserve">after:</w:t>
+      </w:r>
+      <w:r>
+        <w:t xml:space="preserve"> </w:t>
+      </w:r>
+      <w:r>
+        <w:rPr>
+          <w:rStyle w:val="VerbatimChar"/>
+        </w:rPr>
+        <w:t xml:space="preserve">1.6.0</w:t>
+      </w:r>
+      <w:r>
+        <w:t xml:space="preserve"> </w:t>
+      </w:r>
+      <w:r>
+        <w:t xml:space="preserve">(mismatch — npm exit 0 was bluffing)</w:t>
+      </w:r>
+    </w:p>
     <w:bookmarkEnd w:id="57"/>
+    <w:bookmarkStart w:id="58" w:name="X67943cd251212e8a06a649a1edb9bbf1399f5d5"/>
+    <w:p>
+      <w:pPr>
+        <w:pStyle w:val="Heading2"/>
+      </w:pPr>
+      <w:r>
+        <w:t xml:space="preserve">2026-09-29T14:47:30Z — codegraph update FAILED (§107 bluff caught)</w:t>
+      </w:r>
+    </w:p>
+    <w:p>
+      <w:pPr>
+        <w:pStyle w:val="Compact"/>
+        <w:numPr>
+          <w:ilvl w:val="0"/>
+          <w:numId w:val="1048"/>
+        </w:numPr>
+      </w:pPr>
+      <w:r>
+        <w:t xml:space="preserve">before:</w:t>
+      </w:r>
+      <w:r>
+        <w:t xml:space="preserve"> </w:t>
+      </w:r>
+      <w:r>
+        <w:rPr>
+          <w:rStyle w:val="VerbatimChar"/>
+        </w:rPr>
+        <w:t xml:space="preserve">1.6.0</w:t>
+      </w:r>
+    </w:p>
+    <w:p>
+      <w:pPr>
+        <w:pStyle w:val="Compact"/>
+        <w:numPr>
+          <w:ilvl w:val="0"/>
+          <w:numId w:val="1048"/>
+        </w:numPr>
+      </w:pPr>
+      <w:r>
+        <w:t xml:space="preserve">target:</w:t>
+      </w:r>
+      <w:r>
+        <w:t xml:space="preserve"> </w:t>
+      </w:r>
+      <w:r>
+        <w:rPr>
+          <w:rStyle w:val="VerbatimChar"/>
+        </w:rPr>
+        <w:t xml:space="preserve">1.6.1</w:t>
+      </w:r>
+    </w:p>
+    <w:p>
+      <w:pPr>
+        <w:pStyle w:val="Compact"/>
+        <w:numPr>
+          <w:ilvl w:val="0"/>
+          <w:numId w:val="1048"/>
+        </w:numPr>
+      </w:pPr>
+      <w:r>
+        <w:t xml:space="preserve">after:</w:t>
+      </w:r>
+      <w:r>
+        <w:t xml:space="preserve"> </w:t>
+      </w:r>
+      <w:r>
+        <w:rPr>
+          <w:rStyle w:val="VerbatimChar"/>
+        </w:rPr>
+        <w:t xml:space="preserve">1.6.0</w:t>
+      </w:r>
+      <w:r>
+        <w:t xml:space="preserve"> </w:t>
+      </w:r>
+      <w:r>
+        <w:t xml:space="preserve">(mismatch — npm exit 0 was bluffing)</w:t>
+      </w:r>
+    </w:p>
+    <w:bookmarkEnd w:id="58"/>
+    <w:bookmarkStart w:id="59" w:name="X05ab14d81f69d57b7c9bbf17838518c3d8ae85c"/>
+    <w:p>
+      <w:pPr>
+        <w:pStyle w:val="Heading2"/>
+      </w:pPr>
+      <w:r>
+        <w:t xml:space="preserve">2026-09-29T14:56:33Z — codegraph update FAILED (§107 bluff caught)</w:t>
+      </w:r>
+    </w:p>
+    <w:p>
+      <w:pPr>
+        <w:pStyle w:val="Compact"/>
+        <w:numPr>
+          <w:ilvl w:val="0"/>
+          <w:numId w:val="1049"/>
+        </w:numPr>
+      </w:pPr>
+      <w:r>
+        <w:t xml:space="preserve">before:</w:t>
+      </w:r>
+      <w:r>
+        <w:t xml:space="preserve"> </w:t>
+      </w:r>
+      <w:r>
+        <w:rPr>
+          <w:rStyle w:val="VerbatimChar"/>
+        </w:rPr>
+        <w:t xml:space="preserve">1.6.0</w:t>
+      </w:r>
+    </w:p>
+    <w:p>
+      <w:pPr>
+        <w:pStyle w:val="Compact"/>
+        <w:numPr>
+          <w:ilvl w:val="0"/>
+          <w:numId w:val="1049"/>
+        </w:numPr>
+      </w:pPr>
+      <w:r>
+        <w:t xml:space="preserve">target:</w:t>
+      </w:r>
+      <w:r>
+        <w:t xml:space="preserve"> </w:t>
+      </w:r>
+      <w:r>
+        <w:rPr>
+          <w:rStyle w:val="VerbatimChar"/>
+        </w:rPr>
+        <w:t xml:space="preserve">1.6.1</w:t>
+      </w:r>
+    </w:p>
+    <w:p>
+      <w:pPr>
+        <w:pStyle w:val="Compact"/>
+        <w:numPr>
+          <w:ilvl w:val="0"/>
+          <w:numId w:val="1049"/>
+        </w:numPr>
+      </w:pPr>
+      <w:r>
+        <w:t xml:space="preserve">after:</w:t>
+      </w:r>
+      <w:r>
+        <w:t xml:space="preserve"> </w:t>
+      </w:r>
+      <w:r>
+        <w:rPr>
+          <w:rStyle w:val="VerbatimChar"/>
+        </w:rPr>
+        <w:t xml:space="preserve">1.6.0</w:t>
+      </w:r>
+      <w:r>
+        <w:t xml:space="preserve"> </w:t>
+      </w:r>
+      <w:r>
+        <w:t xml:space="preserve">(mismatch — npm exit 0 was bluffing)</w:t>
+      </w:r>
+    </w:p>
+    <w:bookmarkEnd w:id="59"/>
+    <w:bookmarkStart w:id="60" w:name="Xe30bb5a6a00ba8b0e47e838830c7347857bf8e9"/>
+    <w:p>
+      <w:pPr>
+        <w:pStyle w:val="Heading2"/>
+      </w:pPr>
+      <w:r>
+        <w:t xml:space="preserve">2026-09-29T15:17:33Z — codegraph update FAILED (§107 bluff caught)</w:t>
+      </w:r>
+    </w:p>
+    <w:p>
+      <w:pPr>
+        <w:pStyle w:val="Compact"/>
+        <w:numPr>
+          <w:ilvl w:val="0"/>
+          <w:numId w:val="1050"/>
+        </w:numPr>
+      </w:pPr>
+      <w:r>
+        <w:t xml:space="preserve">before:</w:t>
+      </w:r>
+      <w:r>
+        <w:t xml:space="preserve"> </w:t>
+      </w:r>
+      <w:r>
+        <w:rPr>
+          <w:rStyle w:val="VerbatimChar"/>
+        </w:rPr>
+        <w:t xml:space="preserve">1.6.0</w:t>
+      </w:r>
+    </w:p>
+    <w:p>
+      <w:pPr>
+        <w:pStyle w:val="Compact"/>
+        <w:numPr>
+          <w:ilvl w:val="0"/>
+          <w:numId w:val="1050"/>
+        </w:numPr>
+      </w:pPr>
+      <w:r>
+        <w:t xml:space="preserve">target:</w:t>
+      </w:r>
+      <w:r>
+        <w:t xml:space="preserve"> </w:t>
+      </w:r>
+      <w:r>
+        <w:rPr>
+          <w:rStyle w:val="VerbatimChar"/>
+        </w:rPr>
+        <w:t xml:space="preserve">1.6.1</w:t>
+      </w:r>
+    </w:p>
+    <w:p>
+      <w:pPr>
+        <w:pStyle w:val="Compact"/>
+        <w:numPr>
+          <w:ilvl w:val="0"/>
+          <w:numId w:val="1050"/>
+        </w:numPr>
+      </w:pPr>
+      <w:r>
+        <w:t xml:space="preserve">after:</w:t>
+      </w:r>
+      <w:r>
+        <w:t xml:space="preserve"> </w:t>
+      </w:r>
+      <w:r>
+        <w:rPr>
+          <w:rStyle w:val="VerbatimChar"/>
+        </w:rPr>
+        <w:t xml:space="preserve">1.6.0</w:t>
+      </w:r>
+      <w:r>
+        <w:t xml:space="preserve"> </w:t>
+      </w:r>
+      <w:r>
+        <w:t xml:space="preserve">(mismatch — npm exit 0 was bluffing)</w:t>
+      </w:r>
+    </w:p>
+    <w:bookmarkEnd w:id="60"/>
+    <w:bookmarkStart w:id="61" w:name="X48cef82a6ca99f49cc7daf51a8f865921eb99fe"/>
+    <w:p>
+      <w:pPr>
+        <w:pStyle w:val="Heading2"/>
+      </w:pPr>
+      <w:r>
+        <w:t xml:space="preserve">2026-09-29T15:27:35Z — codegraph update FAILED (§107 bluff caught)</w:t>
+      </w:r>
+    </w:p>
+    <w:p>
+      <w:pPr>
+        <w:pStyle w:val="Compact"/>
+        <w:numPr>
+          <w:ilvl w:val="0"/>
+          <w:numId w:val="1051"/>
+        </w:numPr>
+      </w:pPr>
+      <w:r>
+        <w:t xml:space="preserve">before:</w:t>
+      </w:r>
+      <w:r>
+        <w:t xml:space="preserve"> </w:t>
+      </w:r>
+      <w:r>
+        <w:rPr>
+          <w:rStyle w:val="VerbatimChar"/>
+        </w:rPr>
+        <w:t xml:space="preserve">1.6.0</w:t>
+      </w:r>
+    </w:p>
+    <w:p>
+      <w:pPr>
+        <w:pStyle w:val="Compact"/>
+        <w:numPr>
+          <w:ilvl w:val="0"/>
+          <w:numId w:val="1051"/>
+        </w:numPr>
+      </w:pPr>
+      <w:r>
+        <w:t xml:space="preserve">target:</w:t>
+      </w:r>
+      <w:r>
+        <w:t xml:space="preserve"> </w:t>
+      </w:r>
+      <w:r>
+        <w:rPr>
+          <w:rStyle w:val="VerbatimChar"/>
+        </w:rPr>
+        <w:t xml:space="preserve">1.6.1</w:t>
+      </w:r>
+    </w:p>
+    <w:p>
+      <w:pPr>
+        <w:pStyle w:val="Compact"/>
+        <w:numPr>
+          <w:ilvl w:val="0"/>
+          <w:numId w:val="1051"/>
+        </w:numPr>
+      </w:pPr>
+      <w:r>
+        <w:t xml:space="preserve">after:</w:t>
+      </w:r>
+      <w:r>
+        <w:t xml:space="preserve"> </w:t>
+      </w:r>
+      <w:r>
+        <w:rPr>
+          <w:rStyle w:val="VerbatimChar"/>
+        </w:rPr>
+        <w:t xml:space="preserve">1.6.0</w:t>
+      </w:r>
+      <w:r>
+        <w:t xml:space="preserve"> </w:t>
+      </w:r>
+      <w:r>
+        <w:t xml:space="preserve">(mismatch — npm exit 0 was bluffing)</w:t>
+      </w:r>
+    </w:p>
+    <w:bookmarkEnd w:id="61"/>
+    <w:bookmarkEnd w:id="62"/>
     <w:sectPr>
       <w:footnotePr>
         <w:numRestart w:val="eachSect"/>
@@ -4416,6 +4811,21 @@
     <w:abstractNumId w:val="991"/>
   </w:num>
   <w:num w:numId="1046">
+    <w:abstractNumId w:val="991"/>
+  </w:num>
+  <w:num w:numId="1047">
+    <w:abstractNumId w:val="991"/>
+  </w:num>
+  <w:num w:numId="1048">
+    <w:abstractNumId w:val="991"/>
+  </w:num>
+  <w:num w:numId="1049">
+    <w:abstractNumId w:val="991"/>
+  </w:num>
+  <w:num w:numId="1050">
+    <w:abstractNumId w:val="991"/>
+  </w:num>
+  <w:num w:numId="1051">
     <w:abstractNumId w:val="991"/>
   </w:num>
 </w:numbering>

</xml_diff>

<commit_message>
cascade: issues_01: Group A source fixes AU-01..08/12/13 + hardening gates, atmosphere 1.2.1-dev-0.2.9 and speaker mistiq_vader 1.0.0-dev-0.0.1 images flashed (D1/D2), speaker board bring-up fixes, pre-build triage 70->12 FAIL, Group B patch prep, V4/V5/V6 reworks, tracker ATM-1187..1197, progress docs W42; constitution gitlink -> 33ff52e (amendment 11.4.235(E) + kedge removal landed on all 8 remotes)
Co-Authored-By: Claude Sonnet 5.5 <noreply@anthropic.com>

(committed by parent commit_all.sh cascade depth=1)
</commit_message>
<xml_diff>
--- a/docs/codegraph/Status.docx
+++ b/docs/codegraph/Status.docx
@@ -2,7 +2,7 @@
 <file path=word/document.xml><?xml version="1.0" encoding="utf-8"?>
 <w:document xmlns:w="http://schemas.openxmlformats.org/wordprocessingml/2006/main" xmlns:m="http://schemas.openxmlformats.org/officeDocument/2006/math" xmlns:r="http://schemas.openxmlformats.org/officeDocument/2006/relationships" xmlns:o="urn:schemas-microsoft-com:office:office" xmlns:v="urn:schemas-microsoft-com:vml" xmlns:w10="urn:schemas-microsoft-com:office:word" xmlns:a="http://schemas.openxmlformats.org/drawingml/2006/main" xmlns:pic="http://schemas.openxmlformats.org/drawingml/2006/picture" xmlns:wp="http://schemas.openxmlformats.org/drawingml/2006/wordprocessingDrawing">
   <w:body>
-    <w:bookmarkStart w:id="63" w:name="codegraph--status"/>
+    <w:bookmarkStart w:id="64" w:name="codegraph--status"/>
     <w:p>
       <w:pPr>
         <w:pStyle w:val="Heading1"/>
@@ -4956,7 +4956,80 @@
       </w:r>
     </w:p>
     <w:bookmarkEnd w:id="62"/>
+    <w:bookmarkStart w:id="63" w:name="Xc7b6bbff9ae93904e31b64744f696379e732051"/>
+    <w:p>
+      <w:pPr>
+        <w:pStyle w:val="Heading2"/>
+      </w:pPr>
+      <w:r>
+        <w:t xml:space="preserve">2026-10-11T09:34:44Z — codegraph updated</w:t>
+      </w:r>
+    </w:p>
+    <w:p>
+      <w:pPr>
+        <w:pStyle w:val="Compact"/>
+        <w:numPr>
+          <w:ilvl w:val="0"/>
+          <w:numId w:val="1053"/>
+        </w:numPr>
+      </w:pPr>
+      <w:r>
+        <w:t xml:space="preserve">before:</w:t>
+      </w:r>
+      <w:r>
+        <w:t xml:space="preserve"> </w:t>
+      </w:r>
+      <w:r>
+        <w:rPr>
+          <w:rStyle w:val="VerbatimChar"/>
+        </w:rPr>
+        <w:t xml:space="preserve">1.6.0</w:t>
+      </w:r>
+    </w:p>
+    <w:p>
+      <w:pPr>
+        <w:pStyle w:val="Compact"/>
+        <w:numPr>
+          <w:ilvl w:val="0"/>
+          <w:numId w:val="1053"/>
+        </w:numPr>
+      </w:pPr>
+      <w:r>
+        <w:t xml:space="preserve">after:</w:t>
+      </w:r>
+      <w:r>
+        <w:t xml:space="preserve"> </w:t>
+      </w:r>
+      <w:r>
+        <w:rPr>
+          <w:rStyle w:val="VerbatimChar"/>
+        </w:rPr>
+        <w:t xml:space="preserve">1.6.2</w:t>
+      </w:r>
+    </w:p>
+    <w:p>
+      <w:pPr>
+        <w:pStyle w:val="Compact"/>
+        <w:numPr>
+          <w:ilvl w:val="0"/>
+          <w:numId w:val="1053"/>
+        </w:numPr>
+      </w:pPr>
+      <w:r>
+        <w:t xml:space="preserve">npm command:</w:t>
+      </w:r>
+      <w:r>
+        <w:t xml:space="preserve"> </w:t>
+      </w:r>
+      <w:r>
+        <w:rPr>
+          <w:rStyle w:val="VerbatimChar"/>
+        </w:rPr>
+        <w:t xml:space="preserve">npm install -g @colbymchenry/codegraph@1.6.2</w:t>
+      </w:r>
+    </w:p>
     <w:bookmarkEnd w:id="63"/>
+    <w:bookmarkEnd w:id="64"/>
     <w:sectPr>
       <w:footnotePr>
         <w:numRestart w:val="eachSect"/>
@@ -5327,6 +5400,9 @@
     <w:abstractNumId w:val="991"/>
   </w:num>
   <w:num w:numId="1052">
+    <w:abstractNumId w:val="991"/>
+  </w:num>
+  <w:num w:numId="1053">
     <w:abstractNumId w:val="991"/>
   </w:num>
 </w:numbering>

</xml_diff>